<commit_message>
♻️✨ refactor: clean app architecture and add airplane and accommodation workflows
</commit_message>
<xml_diff>
--- a/templates/ordre_mission_template_agent_3_lignes.docx
+++ b/templates/ordre_mission_template_agent_3_lignes.docx
@@ -3913,29 +3913,7 @@
                 <w:szCs w:val="20"/>
                 <w:lang w:val="fr-FR" w:eastAsia="fr-FR" w:bidi="fr-FR"/>
               </w:rPr>
-              <w:t>{{retour_</w:t>
-            </w:r>
-            <w:r>
-              <w:rPr>
-                <w:rFonts w:eastAsia="Courier New" w:cs="Arial" w:ascii="Arial" w:hAnsi="Arial"/>
-                <w:color w:val="000000"/>
-                <w:kern w:val="0"/>
-                <w:sz w:val="20"/>
-                <w:szCs w:val="20"/>
-                <w:lang w:val="fr-FR" w:eastAsia="fr-FR" w:bidi="fr-FR"/>
-              </w:rPr>
-              <w:t>3</w:t>
-            </w:r>
-            <w:r>
-              <w:rPr>
-                <w:rFonts w:eastAsia="Courier New" w:cs="Arial" w:ascii="Arial" w:hAnsi="Arial"/>
-                <w:color w:val="000000"/>
-                <w:kern w:val="0"/>
-                <w:sz w:val="20"/>
-                <w:szCs w:val="20"/>
-                <w:lang w:val="fr-FR" w:eastAsia="fr-FR" w:bidi="fr-FR"/>
-              </w:rPr>
-              <w:t>_depart_ville}}</w:t>
+              <w:t>{{retour_3_depart_ville}}</w:t>
             </w:r>
           </w:p>
         </w:tc>
@@ -3963,8 +3941,92 @@
                 <w:szCs w:val="20"/>
                 <w:lang w:val="fr-FR" w:eastAsia="fr-FR" w:bidi="fr-FR"/>
               </w:rPr>
-              <w:t>{{retour_</w:t>
-            </w:r>
+              <w:t>{{retour_3_date_depart}}</w:t>
+            </w:r>
+          </w:p>
+        </w:tc>
+        <w:tc>
+          <w:tcPr>
+            <w:tcW w:w="1297" w:type="dxa"/>
+            <w:tcBorders>
+              <w:top w:val="single" w:sz="4" w:space="0" w:color="000000"/>
+              <w:left w:val="single" w:sz="4" w:space="0" w:color="000000"/>
+            </w:tcBorders>
+          </w:tcPr>
+          <w:p>
+            <w:pPr>
+              <w:pStyle w:val="Normal"/>
+              <w:widowControl w:val="false"/>
+              <w:rPr>
+                <w:rFonts w:ascii="Arial" w:hAnsi="Arial" w:eastAsia="Courier New" w:cs="Arial"/>
+                <w:color w:val="000000"/>
+                <w:kern w:val="0"/>
+                <w:sz w:val="20"/>
+                <w:szCs w:val="20"/>
+                <w:lang w:val="fr-FR" w:eastAsia="fr-FR" w:bidi="fr-FR"/>
+              </w:rPr>
+            </w:pPr>
+            <w:r>
+              <w:rPr>
+                <w:rFonts w:eastAsia="Courier New" w:cs="Arial" w:ascii="Arial" w:hAnsi="Arial"/>
+                <w:color w:val="000000"/>
+                <w:kern w:val="0"/>
+                <w:sz w:val="20"/>
+                <w:szCs w:val="20"/>
+                <w:lang w:val="fr-FR" w:eastAsia="fr-FR" w:bidi="fr-FR"/>
+              </w:rPr>
+              <w:t>{{retour_2_heure_depart}}</w:t>
+            </w:r>
+          </w:p>
+        </w:tc>
+        <w:tc>
+          <w:tcPr>
+            <w:tcW w:w="2732" w:type="dxa"/>
+            <w:tcBorders>
+              <w:top w:val="single" w:sz="4" w:space="0" w:color="000000"/>
+              <w:left w:val="single" w:sz="4" w:space="0" w:color="000000"/>
+            </w:tcBorders>
+          </w:tcPr>
+          <w:p>
+            <w:pPr>
+              <w:pStyle w:val="Normal"/>
+              <w:widowControl w:val="false"/>
+              <w:rPr>
+                <w:rFonts w:ascii="Arial" w:hAnsi="Arial" w:eastAsia="Courier New" w:cs="Arial"/>
+                <w:color w:val="000000"/>
+                <w:kern w:val="0"/>
+                <w:sz w:val="20"/>
+                <w:szCs w:val="20"/>
+                <w:lang w:val="fr-FR" w:eastAsia="fr-FR" w:bidi="fr-FR"/>
+              </w:rPr>
+            </w:pPr>
+            <w:r>
+              <w:rPr>
+                <w:rFonts w:eastAsia="Courier New" w:cs="Arial" w:ascii="Arial" w:hAnsi="Arial"/>
+                <w:color w:val="000000"/>
+                <w:kern w:val="0"/>
+                <w:sz w:val="20"/>
+                <w:szCs w:val="20"/>
+                <w:lang w:val="fr-FR" w:eastAsia="fr-FR" w:bidi="fr-FR"/>
+              </w:rPr>
+              <w:t>{{retour_3_arrivee_ville}}</w:t>
+            </w:r>
+          </w:p>
+        </w:tc>
+        <w:tc>
+          <w:tcPr>
+            <w:tcW w:w="1297" w:type="dxa"/>
+            <w:tcBorders>
+              <w:top w:val="single" w:sz="4" w:space="0" w:color="000000"/>
+              <w:left w:val="single" w:sz="4" w:space="0" w:color="000000"/>
+            </w:tcBorders>
+          </w:tcPr>
+          <w:p>
+            <w:pPr>
+              <w:pStyle w:val="Normal"/>
+              <w:widowControl w:val="false"/>
+              <w:rPr/>
+            </w:pPr>
             <w:r>
               <w:rPr>
                 <w:rStyle w:val="PlaceholderText"/>
@@ -3975,161 +4037,7 @@
                 <w:szCs w:val="20"/>
                 <w:lang w:val="fr-FR" w:eastAsia="fr-FR" w:bidi="fr-FR"/>
               </w:rPr>
-              <w:t>3</w:t>
-            </w:r>
-            <w:r>
-              <w:rPr>
-                <w:rStyle w:val="PlaceholderText"/>
-                <w:rFonts w:eastAsia="Courier New" w:cs="Arial" w:ascii="Arial" w:hAnsi="Arial"/>
-                <w:color w:val="000000"/>
-                <w:kern w:val="0"/>
-                <w:sz w:val="20"/>
-                <w:szCs w:val="20"/>
-                <w:lang w:val="fr-FR" w:eastAsia="fr-FR" w:bidi="fr-FR"/>
-              </w:rPr>
-              <w:t>_date_depart}}</w:t>
-            </w:r>
-          </w:p>
-        </w:tc>
-        <w:tc>
-          <w:tcPr>
-            <w:tcW w:w="1297" w:type="dxa"/>
-            <w:tcBorders>
-              <w:top w:val="single" w:sz="4" w:space="0" w:color="000000"/>
-              <w:left w:val="single" w:sz="4" w:space="0" w:color="000000"/>
-            </w:tcBorders>
-          </w:tcPr>
-          <w:p>
-            <w:pPr>
-              <w:pStyle w:val="Normal"/>
-              <w:widowControl w:val="false"/>
-              <w:rPr>
-                <w:rFonts w:ascii="Arial" w:hAnsi="Arial" w:eastAsia="Courier New" w:cs="Arial"/>
-                <w:color w:val="000000"/>
-                <w:kern w:val="0"/>
-                <w:sz w:val="20"/>
-                <w:szCs w:val="20"/>
-                <w:lang w:val="fr-FR" w:eastAsia="fr-FR" w:bidi="fr-FR"/>
-              </w:rPr>
-            </w:pPr>
-            <w:r>
-              <w:rPr>
-                <w:rFonts w:eastAsia="Courier New" w:cs="Arial" w:ascii="Arial" w:hAnsi="Arial"/>
-                <w:color w:val="000000"/>
-                <w:kern w:val="0"/>
-                <w:sz w:val="20"/>
-                <w:szCs w:val="20"/>
-                <w:lang w:val="fr-FR" w:eastAsia="fr-FR" w:bidi="fr-FR"/>
-              </w:rPr>
-              <w:t>{{retour_2_heure_depart}}</w:t>
-            </w:r>
-          </w:p>
-        </w:tc>
-        <w:tc>
-          <w:tcPr>
-            <w:tcW w:w="2732" w:type="dxa"/>
-            <w:tcBorders>
-              <w:top w:val="single" w:sz="4" w:space="0" w:color="000000"/>
-              <w:left w:val="single" w:sz="4" w:space="0" w:color="000000"/>
-            </w:tcBorders>
-          </w:tcPr>
-          <w:p>
-            <w:pPr>
-              <w:pStyle w:val="Normal"/>
-              <w:widowControl w:val="false"/>
-              <w:rPr>
-                <w:rFonts w:ascii="Arial" w:hAnsi="Arial" w:eastAsia="Courier New" w:cs="Arial"/>
-                <w:color w:val="000000"/>
-                <w:kern w:val="0"/>
-                <w:sz w:val="20"/>
-                <w:szCs w:val="20"/>
-                <w:lang w:val="fr-FR" w:eastAsia="fr-FR" w:bidi="fr-FR"/>
-              </w:rPr>
-            </w:pPr>
-            <w:r>
-              <w:rPr>
-                <w:rFonts w:eastAsia="Courier New" w:cs="Arial" w:ascii="Arial" w:hAnsi="Arial"/>
-                <w:color w:val="000000"/>
-                <w:kern w:val="0"/>
-                <w:sz w:val="20"/>
-                <w:szCs w:val="20"/>
-                <w:lang w:val="fr-FR" w:eastAsia="fr-FR" w:bidi="fr-FR"/>
-              </w:rPr>
-              <w:t>{{retour_</w:t>
-            </w:r>
-            <w:r>
-              <w:rPr>
-                <w:rFonts w:eastAsia="Courier New" w:cs="Arial" w:ascii="Arial" w:hAnsi="Arial"/>
-                <w:color w:val="000000"/>
-                <w:kern w:val="0"/>
-                <w:sz w:val="20"/>
-                <w:szCs w:val="20"/>
-                <w:lang w:val="fr-FR" w:eastAsia="fr-FR" w:bidi="fr-FR"/>
-              </w:rPr>
-              <w:t>3</w:t>
-            </w:r>
-            <w:r>
-              <w:rPr>
-                <w:rFonts w:eastAsia="Courier New" w:cs="Arial" w:ascii="Arial" w:hAnsi="Arial"/>
-                <w:color w:val="000000"/>
-                <w:kern w:val="0"/>
-                <w:sz w:val="20"/>
-                <w:szCs w:val="20"/>
-                <w:lang w:val="fr-FR" w:eastAsia="fr-FR" w:bidi="fr-FR"/>
-              </w:rPr>
-              <w:t>_arrivee_ville}}</w:t>
-            </w:r>
-          </w:p>
-        </w:tc>
-        <w:tc>
-          <w:tcPr>
-            <w:tcW w:w="1297" w:type="dxa"/>
-            <w:tcBorders>
-              <w:top w:val="single" w:sz="4" w:space="0" w:color="000000"/>
-              <w:left w:val="single" w:sz="4" w:space="0" w:color="000000"/>
-            </w:tcBorders>
-          </w:tcPr>
-          <w:p>
-            <w:pPr>
-              <w:pStyle w:val="Normal"/>
-              <w:widowControl w:val="false"/>
-              <w:rPr/>
-            </w:pPr>
-            <w:r>
-              <w:rPr>
-                <w:rStyle w:val="PlaceholderText"/>
-                <w:rFonts w:eastAsia="Courier New" w:cs="Arial" w:ascii="Arial" w:hAnsi="Arial"/>
-                <w:color w:val="000000"/>
-                <w:kern w:val="0"/>
-                <w:sz w:val="20"/>
-                <w:szCs w:val="20"/>
-                <w:lang w:val="fr-FR" w:eastAsia="fr-FR" w:bidi="fr-FR"/>
-              </w:rPr>
-              <w:t>{{retour_</w:t>
-            </w:r>
-            <w:r>
-              <w:rPr>
-                <w:rStyle w:val="PlaceholderText"/>
-                <w:rFonts w:eastAsia="Courier New" w:cs="Arial" w:ascii="Arial" w:hAnsi="Arial"/>
-                <w:color w:val="000000"/>
-                <w:kern w:val="0"/>
-                <w:sz w:val="20"/>
-                <w:szCs w:val="20"/>
-                <w:lang w:val="fr-FR" w:eastAsia="fr-FR" w:bidi="fr-FR"/>
-              </w:rPr>
-              <w:t>3</w:t>
-            </w:r>
-            <w:r>
-              <w:rPr>
-                <w:rStyle w:val="PlaceholderText"/>
-                <w:rFonts w:eastAsia="Courier New" w:cs="Arial" w:ascii="Arial" w:hAnsi="Arial"/>
-                <w:color w:val="000000"/>
-                <w:kern w:val="0"/>
-                <w:sz w:val="20"/>
-                <w:szCs w:val="20"/>
-                <w:lang w:val="fr-FR" w:eastAsia="fr-FR" w:bidi="fr-FR"/>
-              </w:rPr>
-              <w:t>_date_arrivee}}</w:t>
+              <w:t>{{retour_3_date_arrivee}}</w:t>
             </w:r>
           </w:p>
         </w:tc>
@@ -4888,29 +4796,7 @@
                 <w:szCs w:val="20"/>
                 <w:lang w:val="fr-FR" w:eastAsia="fr-FR" w:bidi="fr-FR"/>
               </w:rPr>
-              <w:t>{{perso_</w:t>
-            </w:r>
-            <w:r>
-              <w:rPr>
-                <w:rFonts w:eastAsia="Courier New" w:cs="Arial" w:ascii="Arial" w:hAnsi="Arial"/>
-                <w:color w:val="000000"/>
-                <w:kern w:val="0"/>
-                <w:sz w:val="20"/>
-                <w:szCs w:val="20"/>
-                <w:lang w:val="fr-FR" w:eastAsia="fr-FR" w:bidi="fr-FR"/>
-              </w:rPr>
-              <w:t>3</w:t>
-            </w:r>
-            <w:r>
-              <w:rPr>
-                <w:rFonts w:eastAsia="Courier New" w:cs="Arial" w:ascii="Arial" w:hAnsi="Arial"/>
-                <w:color w:val="000000"/>
-                <w:kern w:val="0"/>
-                <w:sz w:val="20"/>
-                <w:szCs w:val="20"/>
-                <w:lang w:val="fr-FR" w:eastAsia="fr-FR" w:bidi="fr-FR"/>
-              </w:rPr>
-              <w:t>_depart_ville}}</w:t>
+              <w:t>{{perso_3_depart_ville}}</w:t>
             </w:r>
           </w:p>
         </w:tc>
@@ -4945,8 +4831,99 @@
                 <w:szCs w:val="20"/>
                 <w:lang w:val="fr-FR" w:eastAsia="fr-FR" w:bidi="fr-FR"/>
               </w:rPr>
-              <w:t>{{perso_</w:t>
-            </w:r>
+              <w:t>{{perso_3_date_depart}}</w:t>
+            </w:r>
+          </w:p>
+        </w:tc>
+        <w:tc>
+          <w:tcPr>
+            <w:tcW w:w="1297" w:type="dxa"/>
+            <w:tcBorders>
+              <w:top w:val="single" w:sz="4" w:space="0" w:color="000000"/>
+              <w:left w:val="single" w:sz="4" w:space="0" w:color="000000"/>
+            </w:tcBorders>
+          </w:tcPr>
+          <w:p>
+            <w:pPr>
+              <w:pStyle w:val="Normal"/>
+              <w:widowControl w:val="false"/>
+              <w:rPr>
+                <w:rFonts w:ascii="Arial" w:hAnsi="Arial" w:eastAsia="Courier New" w:cs="Arial"/>
+                <w:color w:val="000000"/>
+                <w:kern w:val="0"/>
+                <w:sz w:val="20"/>
+                <w:szCs w:val="20"/>
+                <w:lang w:val="fr-FR" w:eastAsia="fr-FR" w:bidi="fr-FR"/>
+              </w:rPr>
+            </w:pPr>
+            <w:r>
+              <w:rPr>
+                <w:rFonts w:eastAsia="Courier New" w:cs="Arial" w:ascii="Arial" w:hAnsi="Arial"/>
+                <w:color w:val="000000"/>
+                <w:kern w:val="0"/>
+                <w:sz w:val="20"/>
+                <w:szCs w:val="20"/>
+                <w:lang w:val="fr-FR" w:eastAsia="fr-FR" w:bidi="fr-FR"/>
+              </w:rPr>
+              <w:t>{{perso_3_heure_depart}}</w:t>
+            </w:r>
+          </w:p>
+        </w:tc>
+        <w:tc>
+          <w:tcPr>
+            <w:tcW w:w="2732" w:type="dxa"/>
+            <w:tcBorders>
+              <w:top w:val="single" w:sz="4" w:space="0" w:color="000000"/>
+              <w:left w:val="single" w:sz="4" w:space="0" w:color="000000"/>
+            </w:tcBorders>
+          </w:tcPr>
+          <w:p>
+            <w:pPr>
+              <w:pStyle w:val="Normal"/>
+              <w:widowControl w:val="false"/>
+              <w:rPr>
+                <w:rFonts w:ascii="Arial" w:hAnsi="Arial" w:eastAsia="Courier New" w:cs="Arial"/>
+                <w:color w:val="000000"/>
+                <w:kern w:val="0"/>
+                <w:sz w:val="20"/>
+                <w:szCs w:val="20"/>
+                <w:lang w:val="fr-FR" w:eastAsia="fr-FR" w:bidi="fr-FR"/>
+              </w:rPr>
+            </w:pPr>
+            <w:r>
+              <w:rPr>
+                <w:rFonts w:eastAsia="Courier New" w:cs="Arial" w:ascii="Arial" w:hAnsi="Arial"/>
+                <w:color w:val="000000"/>
+                <w:kern w:val="0"/>
+                <w:sz w:val="20"/>
+                <w:szCs w:val="20"/>
+                <w:lang w:val="fr-FR" w:eastAsia="fr-FR" w:bidi="fr-FR"/>
+              </w:rPr>
+              <w:t>{{perso_3_arrivee_ville}}</w:t>
+            </w:r>
+          </w:p>
+        </w:tc>
+        <w:tc>
+          <w:tcPr>
+            <w:tcW w:w="1297" w:type="dxa"/>
+            <w:tcBorders>
+              <w:top w:val="single" w:sz="4" w:space="0" w:color="000000"/>
+              <w:left w:val="single" w:sz="4" w:space="0" w:color="000000"/>
+            </w:tcBorders>
+          </w:tcPr>
+          <w:p>
+            <w:pPr>
+              <w:pStyle w:val="Normal"/>
+              <w:widowControl w:val="false"/>
+              <w:rPr>
+                <w:rFonts w:ascii="Arial" w:hAnsi="Arial" w:eastAsia="Courier New" w:cs="Arial"/>
+                <w:color w:val="000000"/>
+                <w:kern w:val="0"/>
+                <w:sz w:val="20"/>
+                <w:szCs w:val="20"/>
+                <w:lang w:val="fr-FR" w:eastAsia="fr-FR" w:bidi="fr-FR"/>
+              </w:rPr>
+            </w:pPr>
             <w:r>
               <w:rPr>
                 <w:rStyle w:val="PlaceholderText"/>
@@ -4957,11 +4934,34 @@
                 <w:szCs w:val="20"/>
                 <w:lang w:val="fr-FR" w:eastAsia="fr-FR" w:bidi="fr-FR"/>
               </w:rPr>
-              <w:t>3</w:t>
-            </w:r>
-            <w:r>
-              <w:rPr>
-                <w:rStyle w:val="PlaceholderText"/>
+              <w:t>{{perso_3_date_arrivee}}</w:t>
+            </w:r>
+          </w:p>
+        </w:tc>
+        <w:tc>
+          <w:tcPr>
+            <w:tcW w:w="1358" w:type="dxa"/>
+            <w:tcBorders>
+              <w:top w:val="single" w:sz="4" w:space="0" w:color="000000"/>
+              <w:left w:val="single" w:sz="4" w:space="0" w:color="000000"/>
+              <w:right w:val="single" w:sz="4" w:space="0" w:color="000000"/>
+            </w:tcBorders>
+          </w:tcPr>
+          <w:p>
+            <w:pPr>
+              <w:pStyle w:val="Normal"/>
+              <w:widowControl w:val="false"/>
+              <w:rPr>
+                <w:rFonts w:ascii="Arial" w:hAnsi="Arial" w:eastAsia="Courier New" w:cs="Arial"/>
+                <w:color w:val="000000"/>
+                <w:kern w:val="0"/>
+                <w:sz w:val="20"/>
+                <w:szCs w:val="20"/>
+                <w:lang w:val="fr-FR" w:eastAsia="fr-FR" w:bidi="fr-FR"/>
+              </w:rPr>
+            </w:pPr>
+            <w:r>
+              <w:rPr>
                 <w:rFonts w:eastAsia="Courier New" w:cs="Arial" w:ascii="Arial" w:hAnsi="Arial"/>
                 <w:color w:val="000000"/>
                 <w:kern w:val="0"/>
@@ -4969,235 +4969,7 @@
                 <w:szCs w:val="20"/>
                 <w:lang w:val="fr-FR" w:eastAsia="fr-FR" w:bidi="fr-FR"/>
               </w:rPr>
-              <w:t>_date_depart}}</w:t>
-            </w:r>
-          </w:p>
-        </w:tc>
-        <w:tc>
-          <w:tcPr>
-            <w:tcW w:w="1297" w:type="dxa"/>
-            <w:tcBorders>
-              <w:top w:val="single" w:sz="4" w:space="0" w:color="000000"/>
-              <w:left w:val="single" w:sz="4" w:space="0" w:color="000000"/>
-            </w:tcBorders>
-          </w:tcPr>
-          <w:p>
-            <w:pPr>
-              <w:pStyle w:val="Normal"/>
-              <w:widowControl w:val="false"/>
-              <w:rPr>
-                <w:rFonts w:ascii="Arial" w:hAnsi="Arial" w:eastAsia="Courier New" w:cs="Arial"/>
-                <w:color w:val="000000"/>
-                <w:kern w:val="0"/>
-                <w:sz w:val="20"/>
-                <w:szCs w:val="20"/>
-                <w:lang w:val="fr-FR" w:eastAsia="fr-FR" w:bidi="fr-FR"/>
-              </w:rPr>
-            </w:pPr>
-            <w:r>
-              <w:rPr>
-                <w:rFonts w:eastAsia="Courier New" w:cs="Arial" w:ascii="Arial" w:hAnsi="Arial"/>
-                <w:color w:val="000000"/>
-                <w:kern w:val="0"/>
-                <w:sz w:val="20"/>
-                <w:szCs w:val="20"/>
-                <w:lang w:val="fr-FR" w:eastAsia="fr-FR" w:bidi="fr-FR"/>
-              </w:rPr>
-              <w:t>{{perso_</w:t>
-            </w:r>
-            <w:r>
-              <w:rPr>
-                <w:rFonts w:eastAsia="Courier New" w:cs="Arial" w:ascii="Arial" w:hAnsi="Arial"/>
-                <w:color w:val="000000"/>
-                <w:kern w:val="0"/>
-                <w:sz w:val="20"/>
-                <w:szCs w:val="20"/>
-                <w:lang w:val="fr-FR" w:eastAsia="fr-FR" w:bidi="fr-FR"/>
-              </w:rPr>
-              <w:t>3</w:t>
-            </w:r>
-            <w:r>
-              <w:rPr>
-                <w:rFonts w:eastAsia="Courier New" w:cs="Arial" w:ascii="Arial" w:hAnsi="Arial"/>
-                <w:color w:val="000000"/>
-                <w:kern w:val="0"/>
-                <w:sz w:val="20"/>
-                <w:szCs w:val="20"/>
-                <w:lang w:val="fr-FR" w:eastAsia="fr-FR" w:bidi="fr-FR"/>
-              </w:rPr>
-              <w:t>_heure_depart}}</w:t>
-            </w:r>
-          </w:p>
-        </w:tc>
-        <w:tc>
-          <w:tcPr>
-            <w:tcW w:w="2732" w:type="dxa"/>
-            <w:tcBorders>
-              <w:top w:val="single" w:sz="4" w:space="0" w:color="000000"/>
-              <w:left w:val="single" w:sz="4" w:space="0" w:color="000000"/>
-            </w:tcBorders>
-          </w:tcPr>
-          <w:p>
-            <w:pPr>
-              <w:pStyle w:val="Normal"/>
-              <w:widowControl w:val="false"/>
-              <w:rPr>
-                <w:rFonts w:ascii="Arial" w:hAnsi="Arial" w:eastAsia="Courier New" w:cs="Arial"/>
-                <w:color w:val="000000"/>
-                <w:kern w:val="0"/>
-                <w:sz w:val="20"/>
-                <w:szCs w:val="20"/>
-                <w:lang w:val="fr-FR" w:eastAsia="fr-FR" w:bidi="fr-FR"/>
-              </w:rPr>
-            </w:pPr>
-            <w:r>
-              <w:rPr>
-                <w:rFonts w:eastAsia="Courier New" w:cs="Arial" w:ascii="Arial" w:hAnsi="Arial"/>
-                <w:color w:val="000000"/>
-                <w:kern w:val="0"/>
-                <w:sz w:val="20"/>
-                <w:szCs w:val="20"/>
-                <w:lang w:val="fr-FR" w:eastAsia="fr-FR" w:bidi="fr-FR"/>
-              </w:rPr>
-              <w:t>{{perso_</w:t>
-            </w:r>
-            <w:r>
-              <w:rPr>
-                <w:rFonts w:eastAsia="Courier New" w:cs="Arial" w:ascii="Arial" w:hAnsi="Arial"/>
-                <w:color w:val="000000"/>
-                <w:kern w:val="0"/>
-                <w:sz w:val="20"/>
-                <w:szCs w:val="20"/>
-                <w:lang w:val="fr-FR" w:eastAsia="fr-FR" w:bidi="fr-FR"/>
-              </w:rPr>
-              <w:t>3</w:t>
-            </w:r>
-            <w:r>
-              <w:rPr>
-                <w:rFonts w:eastAsia="Courier New" w:cs="Arial" w:ascii="Arial" w:hAnsi="Arial"/>
-                <w:color w:val="000000"/>
-                <w:kern w:val="0"/>
-                <w:sz w:val="20"/>
-                <w:szCs w:val="20"/>
-                <w:lang w:val="fr-FR" w:eastAsia="fr-FR" w:bidi="fr-FR"/>
-              </w:rPr>
-              <w:t>_arrivee_ville}}</w:t>
-            </w:r>
-          </w:p>
-        </w:tc>
-        <w:tc>
-          <w:tcPr>
-            <w:tcW w:w="1297" w:type="dxa"/>
-            <w:tcBorders>
-              <w:top w:val="single" w:sz="4" w:space="0" w:color="000000"/>
-              <w:left w:val="single" w:sz="4" w:space="0" w:color="000000"/>
-            </w:tcBorders>
-          </w:tcPr>
-          <w:p>
-            <w:pPr>
-              <w:pStyle w:val="Normal"/>
-              <w:widowControl w:val="false"/>
-              <w:rPr>
-                <w:rFonts w:ascii="Arial" w:hAnsi="Arial" w:eastAsia="Courier New" w:cs="Arial"/>
-                <w:color w:val="000000"/>
-                <w:kern w:val="0"/>
-                <w:sz w:val="20"/>
-                <w:szCs w:val="20"/>
-                <w:lang w:val="fr-FR" w:eastAsia="fr-FR" w:bidi="fr-FR"/>
-              </w:rPr>
-            </w:pPr>
-            <w:r>
-              <w:rPr>
-                <w:rStyle w:val="PlaceholderText"/>
-                <w:rFonts w:eastAsia="Courier New" w:cs="Arial" w:ascii="Arial" w:hAnsi="Arial"/>
-                <w:color w:val="000000"/>
-                <w:kern w:val="0"/>
-                <w:sz w:val="20"/>
-                <w:szCs w:val="20"/>
-                <w:lang w:val="fr-FR" w:eastAsia="fr-FR" w:bidi="fr-FR"/>
-              </w:rPr>
-              <w:t>{{perso_</w:t>
-            </w:r>
-            <w:r>
-              <w:rPr>
-                <w:rStyle w:val="PlaceholderText"/>
-                <w:rFonts w:eastAsia="Courier New" w:cs="Arial" w:ascii="Arial" w:hAnsi="Arial"/>
-                <w:color w:val="000000"/>
-                <w:kern w:val="0"/>
-                <w:sz w:val="20"/>
-                <w:szCs w:val="20"/>
-                <w:lang w:val="fr-FR" w:eastAsia="fr-FR" w:bidi="fr-FR"/>
-              </w:rPr>
-              <w:t>3</w:t>
-            </w:r>
-            <w:r>
-              <w:rPr>
-                <w:rStyle w:val="PlaceholderText"/>
-                <w:rFonts w:eastAsia="Courier New" w:cs="Arial" w:ascii="Arial" w:hAnsi="Arial"/>
-                <w:color w:val="000000"/>
-                <w:kern w:val="0"/>
-                <w:sz w:val="20"/>
-                <w:szCs w:val="20"/>
-                <w:lang w:val="fr-FR" w:eastAsia="fr-FR" w:bidi="fr-FR"/>
-              </w:rPr>
-              <w:t>_date_arrivee}}</w:t>
-            </w:r>
-          </w:p>
-        </w:tc>
-        <w:tc>
-          <w:tcPr>
-            <w:tcW w:w="1358" w:type="dxa"/>
-            <w:tcBorders>
-              <w:top w:val="single" w:sz="4" w:space="0" w:color="000000"/>
-              <w:left w:val="single" w:sz="4" w:space="0" w:color="000000"/>
-              <w:right w:val="single" w:sz="4" w:space="0" w:color="000000"/>
-            </w:tcBorders>
-          </w:tcPr>
-          <w:p>
-            <w:pPr>
-              <w:pStyle w:val="Normal"/>
-              <w:widowControl w:val="false"/>
-              <w:rPr>
-                <w:rFonts w:ascii="Arial" w:hAnsi="Arial" w:eastAsia="Courier New" w:cs="Arial"/>
-                <w:color w:val="000000"/>
-                <w:kern w:val="0"/>
-                <w:sz w:val="20"/>
-                <w:szCs w:val="20"/>
-                <w:lang w:val="fr-FR" w:eastAsia="fr-FR" w:bidi="fr-FR"/>
-              </w:rPr>
-            </w:pPr>
-            <w:r>
-              <w:rPr>
-                <w:rFonts w:eastAsia="Courier New" w:cs="Arial" w:ascii="Arial" w:hAnsi="Arial"/>
-                <w:color w:val="000000"/>
-                <w:kern w:val="0"/>
-                <w:sz w:val="20"/>
-                <w:szCs w:val="20"/>
-                <w:lang w:val="fr-FR" w:eastAsia="fr-FR" w:bidi="fr-FR"/>
-              </w:rPr>
-              <w:t>{{perso_</w:t>
-            </w:r>
-            <w:r>
-              <w:rPr>
-                <w:rFonts w:eastAsia="Courier New" w:cs="Arial" w:ascii="Arial" w:hAnsi="Arial"/>
-                <w:color w:val="000000"/>
-                <w:kern w:val="0"/>
-                <w:sz w:val="20"/>
-                <w:szCs w:val="20"/>
-                <w:lang w:val="fr-FR" w:eastAsia="fr-FR" w:bidi="fr-FR"/>
-              </w:rPr>
-              <w:t>3</w:t>
-            </w:r>
-            <w:r>
-              <w:rPr>
-                <w:rFonts w:eastAsia="Courier New" w:cs="Arial" w:ascii="Arial" w:hAnsi="Arial"/>
-                <w:color w:val="000000"/>
-                <w:kern w:val="0"/>
-                <w:sz w:val="20"/>
-                <w:szCs w:val="20"/>
-                <w:lang w:val="fr-FR" w:eastAsia="fr-FR" w:bidi="fr-FR"/>
-              </w:rPr>
-              <w:t>_heure_arrivee}}</w:t>
+              <w:t>{{perso_3_heure_arrivee}}</w:t>
             </w:r>
           </w:p>
         </w:tc>
@@ -5884,19 +5656,15 @@
         <w:spacing w:lineRule="auto" w:line="360" w:before="0" w:after="0"/>
         <w:ind w:left="1420" w:right="0" w:hanging="0"/>
         <w:jc w:val="both"/>
-        <w:rPr/>
+        <w:rPr>
+          <w:rStyle w:val="PlaceholderText"/>
+        </w:rPr>
       </w:pPr>
       <w:r>
         <w:rPr>
           <w:rStyle w:val="Texteducorps"/>
         </w:rPr>
         <w:t xml:space="preserve">Type de véhicule (personnel, location ou co-voiturage) : </w:t>
-      </w:r>
-      <w:r>
-        <w:rPr>
-          <w:rStyle w:val="PlaceholderText"/>
-        </w:rPr>
-        <w:t>Cliquez ou appuyez ici pour entrer du texte.</w:t>
       </w:r>
     </w:p>
     <w:p>
@@ -5920,12 +5688,6 @@
         </w:rPr>
         <w:t xml:space="preserve">Motif d'utilisation (matériel encombrant, destination hors réseau de transport) : </w:t>
       </w:r>
-      <w:r>
-        <w:rPr>
-          <w:rStyle w:val="PlaceholderText"/>
-        </w:rPr>
-        <w:t>Cliquez ou appuyez ici pour entrer du texte.</w:t>
-      </w:r>
     </w:p>
     <w:p>
       <w:pPr>
@@ -5948,12 +5710,6 @@
         </w:rPr>
         <w:t xml:space="preserve">Kilométrage prévu :  </w:t>
       </w:r>
-      <w:r>
-        <w:rPr>
-          <w:rStyle w:val="PlaceholderText"/>
-        </w:rPr>
-        <w:t>Cliquez ou appuyez ici pour entrer du texte.</w:t>
-      </w:r>
     </w:p>
     <w:p>
       <w:pPr>
@@ -5999,12 +5755,6 @@
           <w:rStyle w:val="Texteducorps"/>
         </w:rPr>
         <w:t xml:space="preserve">Immatriculation : </w:t>
-      </w:r>
-      <w:r>
-        <w:rPr>
-          <w:rStyle w:val="PlaceholderText"/>
-        </w:rPr>
-        <w:t>Cliquez ou appuyez ici pour entrer du texte.</w:t>
       </w:r>
     </w:p>
     <w:p>
@@ -9857,7 +9607,7 @@
     <w:pPr>
       <w:widowControl w:val="false"/>
       <w:suppressAutoHyphens w:val="true"/>
-      <w:overflowPunct w:val="false"/>
+      <w:overflowPunct w:val="true"/>
       <w:bidi w:val="0"/>
       <w:spacing w:before="0" w:after="0"/>
       <w:jc w:val="left"/>

</xml_diff>